<commit_message>
chore: back up generated local artifacts
</commit_message>
<xml_diff>
--- a/docs/reports/Report_1_AutoWash_Priority_Booking_Engine.docx
+++ b/docs/reports/Report_1_AutoWash_Priority_Booking_Engine.docx
@@ -309,13 +309,21 @@
         <w:tc>
           <w:tcPr>
             <w:tcW w:w="0" w:type="auto"/>
-            <w:vMerge/>
             <w:vAlign w:val="center"/>
           </w:tcPr>
           <w:p>
             <w:pPr>
               <w:spacing w:after="40" w:line="360" w:lineRule="auto"/>
             </w:pPr>
+            <w:r>
+              <w:rPr>
+                <w:rFonts w:ascii="helvetica neue" w:eastAsia="Georgia" w:hAnsi="helvetica neue" w:cs="Georgia"/>
+                <w:b/>
+                <w:color w:val="000000"/>
+                <w:sz w:val="18"/>
+              </w:rPr>
+              <w:t>Instructor</w:t>
+            </w:r>
           </w:p>
         </w:tc>
         <w:tc>
@@ -334,8 +342,19 @@
                 <w:color w:val="000000"/>
                 <w:sz w:val="18"/>
               </w:rPr>
-              <w:t>Nguyễn Tuấn Minh - SE204693</w:t>
-            </w:r>
+              <w:t xml:space="preserve">Huỳnh Công Việt </w:t>
+            </w:r>
+            <w:proofErr w:type="spellStart"/>
+            <w:r>
+              <w:rPr>
+                <w:rFonts w:ascii="helvetica neue" w:eastAsia="Georgia" w:hAnsi="helvetica neue" w:cs="Georgia"/>
+                <w:i/>
+                <w:color w:val="000000"/>
+                <w:sz w:val="18"/>
+              </w:rPr>
+              <w:t>Ngữ</w:t>
+            </w:r>
+            <w:proofErr w:type="spellEnd"/>
           </w:p>
         </w:tc>
       </w:tr>
@@ -361,7 +380,7 @@
                 <w:color w:val="000000"/>
                 <w:sz w:val="18"/>
               </w:rPr>
-              <w:t>Instructor</w:t>
+              <w:t>Report Number</w:t>
             </w:r>
           </w:p>
         </w:tc>
@@ -381,7 +400,7 @@
                 <w:color w:val="000000"/>
                 <w:sz w:val="18"/>
               </w:rPr>
-              <w:t>Huỳnh Công Việt Ngữ</w:t>
+              <w:t>Report 1</w:t>
             </w:r>
           </w:p>
         </w:tc>
@@ -408,53 +427,6 @@
                 <w:color w:val="000000"/>
                 <w:sz w:val="18"/>
               </w:rPr>
-              <w:t>Report Number</w:t>
-            </w:r>
-          </w:p>
-        </w:tc>
-        <w:tc>
-          <w:tcPr>
-            <w:tcW w:w="5042" w:type="dxa"/>
-            <w:vAlign w:val="center"/>
-          </w:tcPr>
-          <w:p>
-            <w:pPr>
-              <w:spacing w:after="40" w:line="360" w:lineRule="auto"/>
-            </w:pPr>
-            <w:r>
-              <w:rPr>
-                <w:rFonts w:ascii="helvetica neue" w:eastAsia="Georgia" w:hAnsi="helvetica neue" w:cs="Georgia"/>
-                <w:i/>
-                <w:color w:val="000000"/>
-                <w:sz w:val="18"/>
-              </w:rPr>
-              <w:t>Report 1</w:t>
-            </w:r>
-          </w:p>
-        </w:tc>
-      </w:tr>
-      <w:tr>
-        <w:trPr>
-          <w:cantSplit/>
-          <w:tblCellSpacing w:w="0" w:type="dxa"/>
-          <w:jc w:val="center"/>
-        </w:trPr>
-        <w:tc>
-          <w:tcPr>
-            <w:tcW w:w="0" w:type="auto"/>
-            <w:vAlign w:val="center"/>
-          </w:tcPr>
-          <w:p>
-            <w:pPr>
-              <w:spacing w:after="40" w:line="360" w:lineRule="auto"/>
-            </w:pPr>
-            <w:r>
-              <w:rPr>
-                <w:rFonts w:ascii="helvetica neue" w:eastAsia="Georgia" w:hAnsi="helvetica neue" w:cs="Georgia"/>
-                <w:b/>
-                <w:color w:val="000000"/>
-                <w:sz w:val="18"/>
-              </w:rPr>
               <w:t>Class</w:t>
             </w:r>
           </w:p>
@@ -513,12 +485,21 @@
             <w:pPr>
               <w:spacing w:after="40"/>
             </w:pPr>
+            <w:proofErr w:type="spellStart"/>
             <w:r>
               <w:rPr>
                 <w:rFonts w:ascii="helvetica neue" w:hAnsi="helvetica neue"/>
                 <w:sz w:val="18"/>
               </w:rPr>
-              <w:t>AutoWash Priority Booking Engine</w:t>
+              <w:t>AutoWash</w:t>
+            </w:r>
+            <w:proofErr w:type="spellEnd"/>
+            <w:r>
+              <w:rPr>
+                <w:rFonts w:ascii="helvetica neue" w:hAnsi="helvetica neue"/>
+                <w:sz w:val="18"/>
+              </w:rPr>
+              <w:t xml:space="preserve"> Priority Booking Engine</w:t>
             </w:r>
           </w:p>
         </w:tc>
@@ -643,19 +624,47 @@
         <w:rPr>
           <w:rFonts w:ascii="helvetica neue" w:hAnsi="helvetica neue"/>
         </w:rPr>
+        <w:t xml:space="preserve">Project Title: </w:t>
+      </w:r>
+      <w:proofErr w:type="spellStart"/>
+      <w:r>
+        <w:rPr>
+          <w:rFonts w:ascii="helvetica neue" w:hAnsi="helvetica neue"/>
+        </w:rPr>
+        <w:t>AutoWash</w:t>
+      </w:r>
+      <w:proofErr w:type="spellEnd"/>
+      <w:r>
+        <w:rPr>
+          <w:rFonts w:ascii="helvetica neue" w:hAnsi="helvetica neue"/>
+        </w:rPr>
+        <w:t xml:space="preserve"> Priority Booking Engine</w:t>
+      </w:r>
+    </w:p>
+    <w:p>
+      <w:pPr>
+        <w:spacing w:after="100" w:line="360" w:lineRule="auto"/>
+      </w:pPr>
+      <w:r>
+        <w:rPr>
+          <w:rFonts w:ascii="helvetica neue" w:hAnsi="helvetica neue"/>
+        </w:rPr>
         <w:lastRenderedPageBreak/>
-        <w:t>Project Title: AutoWash Priority Booking Engine</w:t>
-      </w:r>
-    </w:p>
-    <w:p>
-      <w:pPr>
-        <w:spacing w:after="100" w:line="360" w:lineRule="auto"/>
-      </w:pPr>
+        <w:t xml:space="preserve">Problem Statement: A car wash shop has </w:t>
+      </w:r>
+      <w:proofErr w:type="gramStart"/>
       <w:r>
         <w:rPr>
           <w:rFonts w:ascii="helvetica neue" w:hAnsi="helvetica neue"/>
         </w:rPr>
-        <w:t>Problem Statement: A car wash shop has limited service capacity in each morning, afternoon, and evening period. Customers may book in advance or request a slot during the active period, while higher membership tiers deserve earlier booking access and priority when capacity is limited. The system must manage customers, vehicles, wash packages, bookings, waiting queues, and completed-service history without using a database. The core data-structure challenge is to balance FIFO service order with tier-based priority and reliable rollback of the latest completion.</w:t>
+        <w:t>limited service</w:t>
+      </w:r>
+      <w:proofErr w:type="gramEnd"/>
+      <w:r>
+        <w:rPr>
+          <w:rFonts w:ascii="helvetica neue" w:hAnsi="helvetica neue"/>
+        </w:rPr>
+        <w:t xml:space="preserve"> capacity in each morning, afternoon, and evening period. Customers may book in advance or request a slot during the active period, while higher membership tiers deserve earlier booking access and priority when capacity is limited. The system must manage customers, vehicles, wash packages, bookings, waiting queues, and completed-service history without using a database. The core data-structure challenge is to balance FIFO service order with tier-based priority and reliable rollback of the latest completion.</w:t>
       </w:r>
     </w:p>
     <w:p>
@@ -701,7 +710,25 @@
           <w:i/>
           <w:color w:val="000000"/>
         </w:rPr>
-        <w:t>Booking creation with membership booking-window and capacity validation.</w:t>
+        <w:t xml:space="preserve">Booking creation with membership </w:t>
+      </w:r>
+      <w:proofErr w:type="gramStart"/>
+      <w:r>
+        <w:rPr>
+          <w:rFonts w:ascii="helvetica neue" w:eastAsia="Georgia" w:hAnsi="helvetica neue" w:cs="Georgia"/>
+          <w:i/>
+          <w:color w:val="000000"/>
+        </w:rPr>
+        <w:t>booking-window</w:t>
+      </w:r>
+      <w:proofErr w:type="gramEnd"/>
+      <w:r>
+        <w:rPr>
+          <w:rFonts w:ascii="helvetica neue" w:eastAsia="Georgia" w:hAnsi="helvetica neue" w:cs="Georgia"/>
+          <w:i/>
+          <w:color w:val="000000"/>
+        </w:rPr>
+        <w:t xml:space="preserve"> and capacity validation.</w:t>
       </w:r>
     </w:p>
     <w:p>
@@ -945,14 +972,25 @@
             <w:pPr>
               <w:spacing w:after="40" w:line="360" w:lineRule="auto"/>
             </w:pPr>
-            <w:r>
-              <w:rPr>
-                <w:rFonts w:ascii="helvetica neue" w:eastAsia="Georgia" w:hAnsi="helvetica neue" w:cs="Georgia"/>
-                <w:i/>
-                <w:color w:val="000000"/>
-                <w:sz w:val="18"/>
-              </w:rPr>
-              <w:t>MyLinkedList&lt;T&gt;</w:t>
+            <w:proofErr w:type="spellStart"/>
+            <w:r>
+              <w:rPr>
+                <w:rFonts w:ascii="helvetica neue" w:eastAsia="Georgia" w:hAnsi="helvetica neue" w:cs="Georgia"/>
+                <w:i/>
+                <w:color w:val="000000"/>
+                <w:sz w:val="18"/>
+              </w:rPr>
+              <w:t>MyLinkedList</w:t>
+            </w:r>
+            <w:proofErr w:type="spellEnd"/>
+            <w:r>
+              <w:rPr>
+                <w:rFonts w:ascii="helvetica neue" w:eastAsia="Georgia" w:hAnsi="helvetica neue" w:cs="Georgia"/>
+                <w:i/>
+                <w:color w:val="000000"/>
+                <w:sz w:val="18"/>
+              </w:rPr>
+              <w:t>&lt;T&gt;</w:t>
             </w:r>
           </w:p>
         </w:tc>
@@ -1026,14 +1064,25 @@
             <w:pPr>
               <w:spacing w:after="40" w:line="360" w:lineRule="auto"/>
             </w:pPr>
-            <w:r>
-              <w:rPr>
-                <w:rFonts w:ascii="helvetica neue" w:eastAsia="Georgia" w:hAnsi="helvetica neue" w:cs="Georgia"/>
-                <w:i/>
-                <w:color w:val="000000"/>
-                <w:sz w:val="18"/>
-              </w:rPr>
-              <w:t>MyQueue&lt;Booking&gt;</w:t>
+            <w:proofErr w:type="spellStart"/>
+            <w:r>
+              <w:rPr>
+                <w:rFonts w:ascii="helvetica neue" w:eastAsia="Georgia" w:hAnsi="helvetica neue" w:cs="Georgia"/>
+                <w:i/>
+                <w:color w:val="000000"/>
+                <w:sz w:val="18"/>
+              </w:rPr>
+              <w:t>MyQueue</w:t>
+            </w:r>
+            <w:proofErr w:type="spellEnd"/>
+            <w:r>
+              <w:rPr>
+                <w:rFonts w:ascii="helvetica neue" w:eastAsia="Georgia" w:hAnsi="helvetica neue" w:cs="Georgia"/>
+                <w:i/>
+                <w:color w:val="000000"/>
+                <w:sz w:val="18"/>
+              </w:rPr>
+              <w:t>&lt;Booking&gt;</w:t>
             </w:r>
           </w:p>
         </w:tc>
@@ -1107,14 +1156,25 @@
             <w:pPr>
               <w:spacing w:after="40" w:line="360" w:lineRule="auto"/>
             </w:pPr>
-            <w:r>
-              <w:rPr>
-                <w:rFonts w:ascii="helvetica neue" w:eastAsia="Georgia" w:hAnsi="helvetica neue" w:cs="Georgia"/>
-                <w:i/>
-                <w:color w:val="000000"/>
-                <w:sz w:val="18"/>
-              </w:rPr>
-              <w:t>MyPriorityQueue&lt;Booking&gt;</w:t>
+            <w:proofErr w:type="spellStart"/>
+            <w:r>
+              <w:rPr>
+                <w:rFonts w:ascii="helvetica neue" w:eastAsia="Georgia" w:hAnsi="helvetica neue" w:cs="Georgia"/>
+                <w:i/>
+                <w:color w:val="000000"/>
+                <w:sz w:val="18"/>
+              </w:rPr>
+              <w:t>MyPriorityQueue</w:t>
+            </w:r>
+            <w:proofErr w:type="spellEnd"/>
+            <w:r>
+              <w:rPr>
+                <w:rFonts w:ascii="helvetica neue" w:eastAsia="Georgia" w:hAnsi="helvetica neue" w:cs="Georgia"/>
+                <w:i/>
+                <w:color w:val="000000"/>
+                <w:sz w:val="18"/>
+              </w:rPr>
+              <w:t>&lt;Booking&gt;</w:t>
             </w:r>
           </w:p>
         </w:tc>
@@ -1189,14 +1249,25 @@
             <w:pPr>
               <w:spacing w:after="40" w:line="360" w:lineRule="auto"/>
             </w:pPr>
-            <w:r>
-              <w:rPr>
-                <w:rFonts w:ascii="helvetica neue" w:eastAsia="Georgia" w:hAnsi="helvetica neue" w:cs="Georgia"/>
-                <w:i/>
-                <w:color w:val="000000"/>
-                <w:sz w:val="18"/>
-              </w:rPr>
-              <w:t>MyStack&lt;Booking&gt;</w:t>
+            <w:proofErr w:type="spellStart"/>
+            <w:r>
+              <w:rPr>
+                <w:rFonts w:ascii="helvetica neue" w:eastAsia="Georgia" w:hAnsi="helvetica neue" w:cs="Georgia"/>
+                <w:i/>
+                <w:color w:val="000000"/>
+                <w:sz w:val="18"/>
+              </w:rPr>
+              <w:t>MyStack</w:t>
+            </w:r>
+            <w:proofErr w:type="spellEnd"/>
+            <w:r>
+              <w:rPr>
+                <w:rFonts w:ascii="helvetica neue" w:eastAsia="Georgia" w:hAnsi="helvetica neue" w:cs="Georgia"/>
+                <w:i/>
+                <w:color w:val="000000"/>
+                <w:sz w:val="18"/>
+              </w:rPr>
+              <w:t>&lt;Booking&gt;</w:t>
             </w:r>
           </w:p>
         </w:tc>
@@ -1409,7 +1480,21 @@
         <w:rPr>
           <w:rFonts w:ascii="helvetica neue" w:hAnsi="helvetica neue"/>
         </w:rPr>
-        <w:t>Module 5 - Service Operations: processes, records payment, completes or cancels bookings, and promotes waitlisted customers.</w:t>
+        <w:t xml:space="preserve">Module 5 - Service Operations: processes, records payment, </w:t>
+      </w:r>
+      <w:proofErr w:type="gramStart"/>
+      <w:r>
+        <w:rPr>
+          <w:rFonts w:ascii="helvetica neue" w:hAnsi="helvetica neue"/>
+        </w:rPr>
+        <w:t>completes</w:t>
+      </w:r>
+      <w:proofErr w:type="gramEnd"/>
+      <w:r>
+        <w:rPr>
+          <w:rFonts w:ascii="helvetica neue" w:hAnsi="helvetica neue"/>
+        </w:rPr>
+        <w:t xml:space="preserve"> or cancels bookings, and promotes waitlisted customers.</w:t>
       </w:r>
     </w:p>
     <w:p>
@@ -1465,19 +1550,6 @@
         <w:t>1.3 Pattern Recognition</w:t>
       </w:r>
       <w:bookmarkEnd w:id="8"/>
-    </w:p>
-    <w:p>
-      <w:pPr>
-        <w:spacing w:after="100" w:line="360" w:lineRule="auto"/>
-        <w:ind w:left="630"/>
-      </w:pPr>
-      <w:r>
-        <w:rPr>
-          <w:rFonts w:ascii="helvetica neue" w:eastAsia="Georgia" w:hAnsi="helvetica neue" w:cs="Georgia"/>
-          <w:color w:val="000000"/>
-        </w:rPr>
-        <w:t>Identify recurring data organization patterns applicable to your system.</w:t>
-      </w:r>
     </w:p>
     <w:p>
       <w:pPr>
@@ -1720,7 +1792,27 @@
                 <w:color w:val="000000"/>
                 <w:sz w:val="18"/>
               </w:rPr>
-              <w:t>Tier-based ordering with creation time as a tie-breaker.</w:t>
+              <w:t xml:space="preserve">Tier-based ordering with creation time as a </w:t>
+            </w:r>
+            <w:proofErr w:type="gramStart"/>
+            <w:r>
+              <w:rPr>
+                <w:rFonts w:ascii="helvetica neue" w:eastAsia="Georgia" w:hAnsi="helvetica neue" w:cs="Georgia"/>
+                <w:i/>
+                <w:color w:val="000000"/>
+                <w:sz w:val="18"/>
+              </w:rPr>
+              <w:t>tie-breaker</w:t>
+            </w:r>
+            <w:proofErr w:type="gramEnd"/>
+            <w:r>
+              <w:rPr>
+                <w:rFonts w:ascii="helvetica neue" w:eastAsia="Georgia" w:hAnsi="helvetica neue" w:cs="Georgia"/>
+                <w:i/>
+                <w:color w:val="000000"/>
+                <w:sz w:val="18"/>
+              </w:rPr>
+              <w:t>.</w:t>
             </w:r>
           </w:p>
         </w:tc>
@@ -1825,7 +1917,27 @@
                 <w:color w:val="000000"/>
                 <w:sz w:val="18"/>
               </w:rPr>
-              <w:t>Undo for the last completed booking.</w:t>
+              <w:t xml:space="preserve">Undo for the last </w:t>
+            </w:r>
+            <w:proofErr w:type="gramStart"/>
+            <w:r>
+              <w:rPr>
+                <w:rFonts w:ascii="helvetica neue" w:eastAsia="Georgia" w:hAnsi="helvetica neue" w:cs="Georgia"/>
+                <w:i/>
+                <w:color w:val="000000"/>
+                <w:sz w:val="18"/>
+              </w:rPr>
+              <w:t>completed</w:t>
+            </w:r>
+            <w:proofErr w:type="gramEnd"/>
+            <w:r>
+              <w:rPr>
+                <w:rFonts w:ascii="helvetica neue" w:eastAsia="Georgia" w:hAnsi="helvetica neue" w:cs="Georgia"/>
+                <w:i/>
+                <w:color w:val="000000"/>
+                <w:sz w:val="18"/>
+              </w:rPr>
+              <w:t xml:space="preserve"> booking.</w:t>
             </w:r>
           </w:p>
         </w:tc>
@@ -1859,7 +1971,6 @@
                 <w:color w:val="000000"/>
                 <w:sz w:val="18"/>
               </w:rPr>
-              <w:lastRenderedPageBreak/>
               <w:t>Linear Search and Selection Sort</w:t>
             </w:r>
           </w:p>
@@ -1924,7 +2035,22 @@
         <w:rPr>
           <w:rFonts w:ascii="helvetica neue" w:hAnsi="helvetica neue"/>
         </w:rPr>
-        <w:t>Justification: The system needs two different ordering policies. A FIFO queue keeps the guaranteed-service process predictable, while a priority queue ensures that waitlisted Platinum, Gold, Silver, and Member customers are treated according to the stated business rule. A stack is appropriate because an undo request always targets only the latest completed booking. Linear search and selection sort are suitable for this academic CLI scope and demonstrate fundamental data-structure operations.</w:t>
+        <w:lastRenderedPageBreak/>
+        <w:t xml:space="preserve">Justification: The system needs two different ordering policies. A FIFO queue keeps the </w:t>
+      </w:r>
+      <w:proofErr w:type="gramStart"/>
+      <w:r>
+        <w:rPr>
+          <w:rFonts w:ascii="helvetica neue" w:hAnsi="helvetica neue"/>
+        </w:rPr>
+        <w:t>guaranteed-service</w:t>
+      </w:r>
+      <w:proofErr w:type="gramEnd"/>
+      <w:r>
+        <w:rPr>
+          <w:rFonts w:ascii="helvetica neue" w:hAnsi="helvetica neue"/>
+        </w:rPr>
+        <w:t xml:space="preserve"> process predictable, while a priority queue ensures that waitlisted Platinum, Gold, Silver, and Member customers are treated according to the stated business rule. A stack is appropriate because an undo request always targets only the latest completed booking. Linear search and selection sort are suitable for this academic CLI scope and demonstrate fundamental data-structure operations.</w:t>
       </w:r>
     </w:p>
     <w:p>
@@ -2053,7 +2179,25 @@
           <w:i/>
           <w:color w:val="000000"/>
         </w:rPr>
-        <w:t>Caption: Mind map of the AutoWash Priority Booking Engine modules and their relationships.</w:t>
+        <w:t xml:space="preserve">Caption: Mind map of the </w:t>
+      </w:r>
+      <w:proofErr w:type="spellStart"/>
+      <w:r>
+        <w:rPr>
+          <w:rFonts w:ascii="helvetica neue" w:eastAsia="Georgia" w:hAnsi="helvetica neue" w:cs="Georgia"/>
+          <w:i/>
+          <w:color w:val="000000"/>
+        </w:rPr>
+        <w:t>AutoWash</w:t>
+      </w:r>
+      <w:proofErr w:type="spellEnd"/>
+      <w:r>
+        <w:rPr>
+          <w:rFonts w:ascii="helvetica neue" w:eastAsia="Georgia" w:hAnsi="helvetica neue" w:cs="Georgia"/>
+          <w:i/>
+          <w:color w:val="000000"/>
+        </w:rPr>
+        <w:t xml:space="preserve"> Priority Booking Engine modules and their relationships.</w:t>
       </w:r>
     </w:p>
     <w:p>
@@ -2088,6 +2232,7 @@
         <w:rPr>
           <w:noProof/>
         </w:rPr>
+        <w:lastRenderedPageBreak/>
         <w:drawing>
           <wp:inline distT="0" distB="0" distL="0" distR="0" wp14:anchorId="23E51EC5" wp14:editId="27DA434F">
             <wp:extent cx="5760720" cy="4160520"/>
@@ -2135,7 +2280,25 @@
           <w:i/>
           <w:color w:val="000000"/>
         </w:rPr>
-        <w:t>Caption: Initial logic flow for creating and allocating a car-wash booking.</w:t>
+        <w:t xml:space="preserve">Caption: Initial logic flow for creating and allocating a </w:t>
+      </w:r>
+      <w:proofErr w:type="gramStart"/>
+      <w:r>
+        <w:rPr>
+          <w:rFonts w:ascii="helvetica neue" w:eastAsia="Georgia" w:hAnsi="helvetica neue" w:cs="Georgia"/>
+          <w:i/>
+          <w:color w:val="000000"/>
+        </w:rPr>
+        <w:t>car-wash</w:t>
+      </w:r>
+      <w:proofErr w:type="gramEnd"/>
+      <w:r>
+        <w:rPr>
+          <w:rFonts w:ascii="helvetica neue" w:eastAsia="Georgia" w:hAnsi="helvetica neue" w:cs="Georgia"/>
+          <w:i/>
+          <w:color w:val="000000"/>
+        </w:rPr>
+        <w:t xml:space="preserve"> booking.</w:t>
       </w:r>
     </w:p>
     <w:p>
@@ -2184,20 +2347,6 @@
           <w:rFonts w:ascii="helvetica neue" w:hAnsi="helvetica neue"/>
         </w:rPr>
         <w:t>Formulated Research Question: How does using a priority queue instead of a standard FIFO queue affect booking fairness and processing efficiency when a car-wash waitlist contains customers with different membership tiers?</w:t>
-      </w:r>
-    </w:p>
-    <w:p>
-      <w:pPr>
-        <w:spacing w:after="100" w:line="360" w:lineRule="auto"/>
-        <w:ind w:left="630"/>
-      </w:pPr>
-      <w:r>
-        <w:rPr>
-          <w:rFonts w:ascii="helvetica neue" w:eastAsia="Georgia" w:hAnsi="helvetica neue" w:cs="Georgia"/>
-          <w:i/>
-          <w:color w:val="000000"/>
-        </w:rPr>
-        <w:t>(Write your RQ here. Example: "How does the choice between ArrayList and LinkedList affect the time complexity of insertion and deletion operations in a library management system with n &gt; 10,000 records?")</w:t>
       </w:r>
     </w:p>
     <w:p>
@@ -3239,6 +3388,17 @@
       <w:contextualSpacing/>
     </w:pPr>
   </w:style>
+  <w:style w:type="paragraph" w:customStyle="1" w:styleId="Normal">
+    <w:name w:val="Normal"/>
+    <w:basedOn w:val="Binhthng"/>
+    <w:rPr>
+      <w:rFonts w:hAnsi="Georgia" w:cs="Times New Roman"/>
+      <w:kern w:val="2"/>
+      <w:szCs w:val="21"/>
+      <w:lang w:val="vi-VN" w:eastAsia="vi-VN"/>
+      <w14:ligatures w14:val="standardContextual"/>
+    </w:rPr>
+  </w:style>
 </w:styles>
 </file>
 

</xml_diff>

<commit_message>
chore(release): sync v1.1.1 project state
</commit_message>
<xml_diff>
--- a/docs/reports/Report_1_AutoWash_Priority_Booking_Engine.docx
+++ b/docs/reports/Report_1_AutoWash_Priority_Booking_Engine.docx
@@ -309,13 +309,21 @@
         <w:tc>
           <w:tcPr>
             <w:tcW w:w="0" w:type="auto"/>
-            <w:vMerge/>
             <w:vAlign w:val="center"/>
           </w:tcPr>
           <w:p>
             <w:pPr>
               <w:spacing w:after="40" w:line="360" w:lineRule="auto"/>
             </w:pPr>
+            <w:r>
+              <w:rPr>
+                <w:rFonts w:ascii="helvetica neue" w:eastAsia="Georgia" w:hAnsi="helvetica neue" w:cs="Georgia"/>
+                <w:b/>
+                <w:color w:val="000000"/>
+                <w:sz w:val="18"/>
+              </w:rPr>
+              <w:t>Instructor</w:t>
+            </w:r>
           </w:p>
         </w:tc>
         <w:tc>
@@ -334,8 +342,19 @@
                 <w:color w:val="000000"/>
                 <w:sz w:val="18"/>
               </w:rPr>
-              <w:t>Nguyễn Tuấn Minh - SE204693</w:t>
-            </w:r>
+              <w:t xml:space="preserve">Huỳnh Công Việt </w:t>
+            </w:r>
+            <w:proofErr w:type="spellStart"/>
+            <w:r>
+              <w:rPr>
+                <w:rFonts w:ascii="helvetica neue" w:eastAsia="Georgia" w:hAnsi="helvetica neue" w:cs="Georgia"/>
+                <w:i/>
+                <w:color w:val="000000"/>
+                <w:sz w:val="18"/>
+              </w:rPr>
+              <w:t>Ngữ</w:t>
+            </w:r>
+            <w:proofErr w:type="spellEnd"/>
           </w:p>
         </w:tc>
       </w:tr>
@@ -361,7 +380,7 @@
                 <w:color w:val="000000"/>
                 <w:sz w:val="18"/>
               </w:rPr>
-              <w:t>Instructor</w:t>
+              <w:t>Report Number</w:t>
             </w:r>
           </w:p>
         </w:tc>
@@ -381,7 +400,7 @@
                 <w:color w:val="000000"/>
                 <w:sz w:val="18"/>
               </w:rPr>
-              <w:t>Huỳnh Công Việt Ngữ</w:t>
+              <w:t>Report 1</w:t>
             </w:r>
           </w:p>
         </w:tc>
@@ -408,53 +427,6 @@
                 <w:color w:val="000000"/>
                 <w:sz w:val="18"/>
               </w:rPr>
-              <w:t>Report Number</w:t>
-            </w:r>
-          </w:p>
-        </w:tc>
-        <w:tc>
-          <w:tcPr>
-            <w:tcW w:w="5042" w:type="dxa"/>
-            <w:vAlign w:val="center"/>
-          </w:tcPr>
-          <w:p>
-            <w:pPr>
-              <w:spacing w:after="40" w:line="360" w:lineRule="auto"/>
-            </w:pPr>
-            <w:r>
-              <w:rPr>
-                <w:rFonts w:ascii="helvetica neue" w:eastAsia="Georgia" w:hAnsi="helvetica neue" w:cs="Georgia"/>
-                <w:i/>
-                <w:color w:val="000000"/>
-                <w:sz w:val="18"/>
-              </w:rPr>
-              <w:t>Report 1</w:t>
-            </w:r>
-          </w:p>
-        </w:tc>
-      </w:tr>
-      <w:tr>
-        <w:trPr>
-          <w:cantSplit/>
-          <w:tblCellSpacing w:w="0" w:type="dxa"/>
-          <w:jc w:val="center"/>
-        </w:trPr>
-        <w:tc>
-          <w:tcPr>
-            <w:tcW w:w="0" w:type="auto"/>
-            <w:vAlign w:val="center"/>
-          </w:tcPr>
-          <w:p>
-            <w:pPr>
-              <w:spacing w:after="40" w:line="360" w:lineRule="auto"/>
-            </w:pPr>
-            <w:r>
-              <w:rPr>
-                <w:rFonts w:ascii="helvetica neue" w:eastAsia="Georgia" w:hAnsi="helvetica neue" w:cs="Georgia"/>
-                <w:b/>
-                <w:color w:val="000000"/>
-                <w:sz w:val="18"/>
-              </w:rPr>
               <w:t>Class</w:t>
             </w:r>
           </w:p>
@@ -513,12 +485,21 @@
             <w:pPr>
               <w:spacing w:after="40"/>
             </w:pPr>
+            <w:proofErr w:type="spellStart"/>
             <w:r>
               <w:rPr>
                 <w:rFonts w:ascii="helvetica neue" w:hAnsi="helvetica neue"/>
                 <w:sz w:val="18"/>
               </w:rPr>
-              <w:t>AutoWash Priority Booking Engine</w:t>
+              <w:t>AutoWash</w:t>
+            </w:r>
+            <w:proofErr w:type="spellEnd"/>
+            <w:r>
+              <w:rPr>
+                <w:rFonts w:ascii="helvetica neue" w:hAnsi="helvetica neue"/>
+                <w:sz w:val="18"/>
+              </w:rPr>
+              <w:t xml:space="preserve"> Priority Booking Engine</w:t>
             </w:r>
           </w:p>
         </w:tc>
@@ -643,19 +624,47 @@
         <w:rPr>
           <w:rFonts w:ascii="helvetica neue" w:hAnsi="helvetica neue"/>
         </w:rPr>
+        <w:t xml:space="preserve">Project Title: </w:t>
+      </w:r>
+      <w:proofErr w:type="spellStart"/>
+      <w:r>
+        <w:rPr>
+          <w:rFonts w:ascii="helvetica neue" w:hAnsi="helvetica neue"/>
+        </w:rPr>
+        <w:t>AutoWash</w:t>
+      </w:r>
+      <w:proofErr w:type="spellEnd"/>
+      <w:r>
+        <w:rPr>
+          <w:rFonts w:ascii="helvetica neue" w:hAnsi="helvetica neue"/>
+        </w:rPr>
+        <w:t xml:space="preserve"> Priority Booking Engine</w:t>
+      </w:r>
+    </w:p>
+    <w:p>
+      <w:pPr>
+        <w:spacing w:after="100" w:line="360" w:lineRule="auto"/>
+      </w:pPr>
+      <w:r>
+        <w:rPr>
+          <w:rFonts w:ascii="helvetica neue" w:hAnsi="helvetica neue"/>
+        </w:rPr>
         <w:lastRenderedPageBreak/>
-        <w:t>Project Title: AutoWash Priority Booking Engine</w:t>
-      </w:r>
-    </w:p>
-    <w:p>
-      <w:pPr>
-        <w:spacing w:after="100" w:line="360" w:lineRule="auto"/>
-      </w:pPr>
+        <w:t xml:space="preserve">Problem Statement: A car wash shop has </w:t>
+      </w:r>
+      <w:proofErr w:type="gramStart"/>
       <w:r>
         <w:rPr>
           <w:rFonts w:ascii="helvetica neue" w:hAnsi="helvetica neue"/>
         </w:rPr>
-        <w:t>Problem Statement: A car wash shop has limited service capacity in each morning, afternoon, and evening period. Customers may book in advance or request a slot during the active period, while higher membership tiers deserve earlier booking access and priority when capacity is limited. The system must manage customers, vehicles, wash packages, bookings, waiting queues, and completed-service history without using a database. The core data-structure challenge is to balance FIFO service order with tier-based priority and reliable rollback of the latest completion.</w:t>
+        <w:t>limited service</w:t>
+      </w:r>
+      <w:proofErr w:type="gramEnd"/>
+      <w:r>
+        <w:rPr>
+          <w:rFonts w:ascii="helvetica neue" w:hAnsi="helvetica neue"/>
+        </w:rPr>
+        <w:t xml:space="preserve"> capacity in each morning, afternoon, and evening period. Customers may book in advance or request a slot during the active period, while higher membership tiers deserve earlier booking access and priority when capacity is limited. The system must manage customers, vehicles, wash packages, bookings, waiting queues, and completed-service history without using a database. The core data-structure challenge is to balance FIFO service order with tier-based priority and reliable rollback of the latest completion.</w:t>
       </w:r>
     </w:p>
     <w:p>
@@ -701,7 +710,25 @@
           <w:i/>
           <w:color w:val="000000"/>
         </w:rPr>
-        <w:t>Booking creation with membership booking-window and capacity validation.</w:t>
+        <w:t xml:space="preserve">Booking creation with membership </w:t>
+      </w:r>
+      <w:proofErr w:type="gramStart"/>
+      <w:r>
+        <w:rPr>
+          <w:rFonts w:ascii="helvetica neue" w:eastAsia="Georgia" w:hAnsi="helvetica neue" w:cs="Georgia"/>
+          <w:i/>
+          <w:color w:val="000000"/>
+        </w:rPr>
+        <w:t>booking-window</w:t>
+      </w:r>
+      <w:proofErr w:type="gramEnd"/>
+      <w:r>
+        <w:rPr>
+          <w:rFonts w:ascii="helvetica neue" w:eastAsia="Georgia" w:hAnsi="helvetica neue" w:cs="Georgia"/>
+          <w:i/>
+          <w:color w:val="000000"/>
+        </w:rPr>
+        <w:t xml:space="preserve"> and capacity validation.</w:t>
       </w:r>
     </w:p>
     <w:p>
@@ -843,10 +870,13 @@
           <w:p>
             <w:pPr>
               <w:spacing w:line="360" w:lineRule="auto"/>
-            </w:pPr>
-            <w:r>
-              <w:rPr>
-                <w:rFonts w:ascii="helvetica neue" w:eastAsia="helvetica neue" w:hAnsi="helvetica neue" w:cs="helvetica neue"/>
+              <w:rPr>
+                <w:rFonts w:ascii="helvetica neue" w:hAnsi="helvetica neue"/>
+              </w:rPr>
+            </w:pPr>
+            <w:r>
+              <w:rPr>
+                <w:rFonts w:ascii="Helv" w:eastAsia="helvetica neue" w:hAnsi="Helv" w:cs="helvetica neue"/>
                 <w:color w:val="000000"/>
                 <w:sz w:val="17"/>
               </w:rPr>
@@ -919,10 +949,13 @@
           <w:p>
             <w:pPr>
               <w:spacing w:after="40" w:line="360" w:lineRule="auto"/>
-            </w:pPr>
-            <w:r>
-              <w:rPr>
-                <w:rFonts w:ascii="helvetica neue" w:eastAsia="Georgia" w:hAnsi="helvetica neue" w:cs="Georgia"/>
+              <w:rPr>
+                <w:rFonts w:ascii="Helv" w:hAnsi="Helv"/>
+              </w:rPr>
+            </w:pPr>
+            <w:r>
+              <w:rPr>
+                <w:rFonts w:ascii="Helv" w:eastAsia="Georgia" w:hAnsi="Helv" w:cs="Georgia"/>
                 <w:i/>
                 <w:color w:val="000000"/>
                 <w:sz w:val="18"/>
@@ -945,14 +978,25 @@
             <w:pPr>
               <w:spacing w:after="40" w:line="360" w:lineRule="auto"/>
             </w:pPr>
-            <w:r>
-              <w:rPr>
-                <w:rFonts w:ascii="helvetica neue" w:eastAsia="Georgia" w:hAnsi="helvetica neue" w:cs="Georgia"/>
-                <w:i/>
-                <w:color w:val="000000"/>
-                <w:sz w:val="18"/>
-              </w:rPr>
-              <w:t>MyLinkedList&lt;T&gt;</w:t>
+            <w:proofErr w:type="spellStart"/>
+            <w:r>
+              <w:rPr>
+                <w:rFonts w:ascii="helvetica neue" w:eastAsia="Georgia" w:hAnsi="helvetica neue" w:cs="Georgia"/>
+                <w:i/>
+                <w:color w:val="000000"/>
+                <w:sz w:val="18"/>
+              </w:rPr>
+              <w:t>MyLinkedList</w:t>
+            </w:r>
+            <w:proofErr w:type="spellEnd"/>
+            <w:r>
+              <w:rPr>
+                <w:rFonts w:ascii="helvetica neue" w:eastAsia="Georgia" w:hAnsi="helvetica neue" w:cs="Georgia"/>
+                <w:i/>
+                <w:color w:val="000000"/>
+                <w:sz w:val="18"/>
+              </w:rPr>
+              <w:t>&lt;T&gt;</w:t>
             </w:r>
           </w:p>
         </w:tc>
@@ -1000,10 +1044,13 @@
           <w:p>
             <w:pPr>
               <w:spacing w:after="40" w:line="360" w:lineRule="auto"/>
-            </w:pPr>
-            <w:r>
-              <w:rPr>
-                <w:rFonts w:ascii="helvetica neue" w:eastAsia="Georgia" w:hAnsi="helvetica neue" w:cs="Georgia"/>
+              <w:rPr>
+                <w:rFonts w:ascii="Helv" w:hAnsi="Helv"/>
+              </w:rPr>
+            </w:pPr>
+            <w:r>
+              <w:rPr>
+                <w:rFonts w:ascii="Helv" w:eastAsia="Georgia" w:hAnsi="Helv" w:cs="Georgia"/>
                 <w:i/>
                 <w:color w:val="000000"/>
                 <w:sz w:val="18"/>
@@ -1026,14 +1073,25 @@
             <w:pPr>
               <w:spacing w:after="40" w:line="360" w:lineRule="auto"/>
             </w:pPr>
-            <w:r>
-              <w:rPr>
-                <w:rFonts w:ascii="helvetica neue" w:eastAsia="Georgia" w:hAnsi="helvetica neue" w:cs="Georgia"/>
-                <w:i/>
-                <w:color w:val="000000"/>
-                <w:sz w:val="18"/>
-              </w:rPr>
-              <w:t>MyQueue&lt;Booking&gt;</w:t>
+            <w:proofErr w:type="spellStart"/>
+            <w:r>
+              <w:rPr>
+                <w:rFonts w:ascii="helvetica neue" w:eastAsia="Georgia" w:hAnsi="helvetica neue" w:cs="Georgia"/>
+                <w:i/>
+                <w:color w:val="000000"/>
+                <w:sz w:val="18"/>
+              </w:rPr>
+              <w:t>MyQueue</w:t>
+            </w:r>
+            <w:proofErr w:type="spellEnd"/>
+            <w:r>
+              <w:rPr>
+                <w:rFonts w:ascii="helvetica neue" w:eastAsia="Georgia" w:hAnsi="helvetica neue" w:cs="Georgia"/>
+                <w:i/>
+                <w:color w:val="000000"/>
+                <w:sz w:val="18"/>
+              </w:rPr>
+              <w:t>&lt;Booking&gt;</w:t>
             </w:r>
           </w:p>
         </w:tc>
@@ -1081,10 +1139,13 @@
           <w:p>
             <w:pPr>
               <w:spacing w:after="40" w:line="360" w:lineRule="auto"/>
-            </w:pPr>
-            <w:r>
-              <w:rPr>
-                <w:rFonts w:ascii="helvetica neue" w:eastAsia="Georgia" w:hAnsi="helvetica neue" w:cs="Georgia"/>
+              <w:rPr>
+                <w:rFonts w:ascii="Helv" w:hAnsi="Helv"/>
+              </w:rPr>
+            </w:pPr>
+            <w:r>
+              <w:rPr>
+                <w:rFonts w:ascii="Helv" w:eastAsia="Georgia" w:hAnsi="Helv" w:cs="Georgia"/>
                 <w:i/>
                 <w:color w:val="000000"/>
                 <w:sz w:val="18"/>
@@ -1107,14 +1168,25 @@
             <w:pPr>
               <w:spacing w:after="40" w:line="360" w:lineRule="auto"/>
             </w:pPr>
-            <w:r>
-              <w:rPr>
-                <w:rFonts w:ascii="helvetica neue" w:eastAsia="Georgia" w:hAnsi="helvetica neue" w:cs="Georgia"/>
-                <w:i/>
-                <w:color w:val="000000"/>
-                <w:sz w:val="18"/>
-              </w:rPr>
-              <w:t>MyPriorityQueue&lt;Booking&gt;</w:t>
+            <w:proofErr w:type="spellStart"/>
+            <w:r>
+              <w:rPr>
+                <w:rFonts w:ascii="helvetica neue" w:eastAsia="Georgia" w:hAnsi="helvetica neue" w:cs="Georgia"/>
+                <w:i/>
+                <w:color w:val="000000"/>
+                <w:sz w:val="18"/>
+              </w:rPr>
+              <w:t>MyPriorityQueue</w:t>
+            </w:r>
+            <w:proofErr w:type="spellEnd"/>
+            <w:r>
+              <w:rPr>
+                <w:rFonts w:ascii="helvetica neue" w:eastAsia="Georgia" w:hAnsi="helvetica neue" w:cs="Georgia"/>
+                <w:i/>
+                <w:color w:val="000000"/>
+                <w:sz w:val="18"/>
+              </w:rPr>
+              <w:t>&lt;Booking&gt;</w:t>
             </w:r>
           </w:p>
         </w:tc>
@@ -1162,10 +1234,13 @@
           <w:p>
             <w:pPr>
               <w:spacing w:after="40" w:line="360" w:lineRule="auto"/>
-            </w:pPr>
-            <w:r>
-              <w:rPr>
-                <w:rFonts w:ascii="helvetica neue" w:eastAsia="Georgia" w:hAnsi="helvetica neue" w:cs="Georgia"/>
+              <w:rPr>
+                <w:rFonts w:ascii="Helv" w:hAnsi="Helv"/>
+              </w:rPr>
+            </w:pPr>
+            <w:r>
+              <w:rPr>
+                <w:rFonts w:ascii="Helv" w:eastAsia="Georgia" w:hAnsi="Helv" w:cs="Georgia"/>
                 <w:i/>
                 <w:color w:val="000000"/>
                 <w:sz w:val="18"/>
@@ -1189,14 +1264,25 @@
             <w:pPr>
               <w:spacing w:after="40" w:line="360" w:lineRule="auto"/>
             </w:pPr>
-            <w:r>
-              <w:rPr>
-                <w:rFonts w:ascii="helvetica neue" w:eastAsia="Georgia" w:hAnsi="helvetica neue" w:cs="Georgia"/>
-                <w:i/>
-                <w:color w:val="000000"/>
-                <w:sz w:val="18"/>
-              </w:rPr>
-              <w:t>MyStack&lt;Booking&gt;</w:t>
+            <w:proofErr w:type="spellStart"/>
+            <w:r>
+              <w:rPr>
+                <w:rFonts w:ascii="helvetica neue" w:eastAsia="Georgia" w:hAnsi="helvetica neue" w:cs="Georgia"/>
+                <w:i/>
+                <w:color w:val="000000"/>
+                <w:sz w:val="18"/>
+              </w:rPr>
+              <w:t>MyStack</w:t>
+            </w:r>
+            <w:proofErr w:type="spellEnd"/>
+            <w:r>
+              <w:rPr>
+                <w:rFonts w:ascii="helvetica neue" w:eastAsia="Georgia" w:hAnsi="helvetica neue" w:cs="Georgia"/>
+                <w:i/>
+                <w:color w:val="000000"/>
+                <w:sz w:val="18"/>
+              </w:rPr>
+              <w:t>&lt;Booking&gt;</w:t>
             </w:r>
           </w:p>
         </w:tc>
@@ -1241,10 +1327,13 @@
           <w:p>
             <w:pPr>
               <w:spacing w:after="40"/>
-            </w:pPr>
-            <w:r>
-              <w:rPr>
-                <w:rFonts w:ascii="helvetica neue" w:hAnsi="helvetica neue"/>
+              <w:rPr>
+                <w:rFonts w:ascii="Helv" w:hAnsi="Helv"/>
+              </w:rPr>
+            </w:pPr>
+            <w:r>
+              <w:rPr>
+                <w:rFonts w:ascii="Helv" w:hAnsi="Helv"/>
                 <w:sz w:val="18"/>
               </w:rPr>
               <w:t>Booking-Window Configuration</w:t>
@@ -1409,7 +1498,21 @@
         <w:rPr>
           <w:rFonts w:ascii="helvetica neue" w:hAnsi="helvetica neue"/>
         </w:rPr>
-        <w:t>Module 5 - Service Operations: processes, records payment, completes or cancels bookings, and promotes waitlisted customers.</w:t>
+        <w:t xml:space="preserve">Module 5 - Service Operations: processes, records payment, </w:t>
+      </w:r>
+      <w:proofErr w:type="gramStart"/>
+      <w:r>
+        <w:rPr>
+          <w:rFonts w:ascii="helvetica neue" w:hAnsi="helvetica neue"/>
+        </w:rPr>
+        <w:t>completes</w:t>
+      </w:r>
+      <w:proofErr w:type="gramEnd"/>
+      <w:r>
+        <w:rPr>
+          <w:rFonts w:ascii="helvetica neue" w:hAnsi="helvetica neue"/>
+        </w:rPr>
+        <w:t xml:space="preserve"> or cancels bookings, and promotes waitlisted customers.</w:t>
       </w:r>
     </w:p>
     <w:p>
@@ -1465,19 +1568,6 @@
         <w:t>1.3 Pattern Recognition</w:t>
       </w:r>
       <w:bookmarkEnd w:id="8"/>
-    </w:p>
-    <w:p>
-      <w:pPr>
-        <w:spacing w:after="100" w:line="360" w:lineRule="auto"/>
-        <w:ind w:left="630"/>
-      </w:pPr>
-      <w:r>
-        <w:rPr>
-          <w:rFonts w:ascii="helvetica neue" w:eastAsia="Georgia" w:hAnsi="helvetica neue" w:cs="Georgia"/>
-          <w:color w:val="000000"/>
-        </w:rPr>
-        <w:t>Identify recurring data organization patterns applicable to your system.</w:t>
-      </w:r>
     </w:p>
     <w:p>
       <w:pPr>
@@ -1720,7 +1810,27 @@
                 <w:color w:val="000000"/>
                 <w:sz w:val="18"/>
               </w:rPr>
-              <w:t>Tier-based ordering with creation time as a tie-breaker.</w:t>
+              <w:t xml:space="preserve">Tier-based ordering with creation time as a </w:t>
+            </w:r>
+            <w:proofErr w:type="gramStart"/>
+            <w:r>
+              <w:rPr>
+                <w:rFonts w:ascii="helvetica neue" w:eastAsia="Georgia" w:hAnsi="helvetica neue" w:cs="Georgia"/>
+                <w:i/>
+                <w:color w:val="000000"/>
+                <w:sz w:val="18"/>
+              </w:rPr>
+              <w:t>tie-breaker</w:t>
+            </w:r>
+            <w:proofErr w:type="gramEnd"/>
+            <w:r>
+              <w:rPr>
+                <w:rFonts w:ascii="helvetica neue" w:eastAsia="Georgia" w:hAnsi="helvetica neue" w:cs="Georgia"/>
+                <w:i/>
+                <w:color w:val="000000"/>
+                <w:sz w:val="18"/>
+              </w:rPr>
+              <w:t>.</w:t>
             </w:r>
           </w:p>
         </w:tc>
@@ -1825,7 +1935,27 @@
                 <w:color w:val="000000"/>
                 <w:sz w:val="18"/>
               </w:rPr>
-              <w:t>Undo for the last completed booking.</w:t>
+              <w:t xml:space="preserve">Undo for the last </w:t>
+            </w:r>
+            <w:proofErr w:type="gramStart"/>
+            <w:r>
+              <w:rPr>
+                <w:rFonts w:ascii="helvetica neue" w:eastAsia="Georgia" w:hAnsi="helvetica neue" w:cs="Georgia"/>
+                <w:i/>
+                <w:color w:val="000000"/>
+                <w:sz w:val="18"/>
+              </w:rPr>
+              <w:t>completed</w:t>
+            </w:r>
+            <w:proofErr w:type="gramEnd"/>
+            <w:r>
+              <w:rPr>
+                <w:rFonts w:ascii="helvetica neue" w:eastAsia="Georgia" w:hAnsi="helvetica neue" w:cs="Georgia"/>
+                <w:i/>
+                <w:color w:val="000000"/>
+                <w:sz w:val="18"/>
+              </w:rPr>
+              <w:t xml:space="preserve"> booking.</w:t>
             </w:r>
           </w:p>
         </w:tc>
@@ -1859,7 +1989,6 @@
                 <w:color w:val="000000"/>
                 <w:sz w:val="18"/>
               </w:rPr>
-              <w:lastRenderedPageBreak/>
               <w:t>Linear Search and Selection Sort</w:t>
             </w:r>
           </w:p>
@@ -1924,7 +2053,22 @@
         <w:rPr>
           <w:rFonts w:ascii="helvetica neue" w:hAnsi="helvetica neue"/>
         </w:rPr>
-        <w:t>Justification: The system needs two different ordering policies. A FIFO queue keeps the guaranteed-service process predictable, while a priority queue ensures that waitlisted Platinum, Gold, Silver, and Member customers are treated according to the stated business rule. A stack is appropriate because an undo request always targets only the latest completed booking. Linear search and selection sort are suitable for this academic CLI scope and demonstrate fundamental data-structure operations.</w:t>
+        <w:lastRenderedPageBreak/>
+        <w:t xml:space="preserve">Justification: The system needs two different ordering policies. A FIFO queue keeps the </w:t>
+      </w:r>
+      <w:proofErr w:type="gramStart"/>
+      <w:r>
+        <w:rPr>
+          <w:rFonts w:ascii="helvetica neue" w:hAnsi="helvetica neue"/>
+        </w:rPr>
+        <w:t>guaranteed-service</w:t>
+      </w:r>
+      <w:proofErr w:type="gramEnd"/>
+      <w:r>
+        <w:rPr>
+          <w:rFonts w:ascii="helvetica neue" w:hAnsi="helvetica neue"/>
+        </w:rPr>
+        <w:t xml:space="preserve"> process predictable, while a priority queue ensures that waitlisted Platinum, Gold, Silver, and Member customers are treated according to the stated business rule. A stack is appropriate because an undo request always targets only the latest completed booking. Linear search and selection sort are suitable for this academic CLI scope and demonstrate fundamental data-structure operations.</w:t>
       </w:r>
     </w:p>
     <w:p>
@@ -2053,7 +2197,25 @@
           <w:i/>
           <w:color w:val="000000"/>
         </w:rPr>
-        <w:t>Caption: Mind map of the AutoWash Priority Booking Engine modules and their relationships.</w:t>
+        <w:t xml:space="preserve">Caption: Mind map of the </w:t>
+      </w:r>
+      <w:proofErr w:type="spellStart"/>
+      <w:r>
+        <w:rPr>
+          <w:rFonts w:ascii="helvetica neue" w:eastAsia="Georgia" w:hAnsi="helvetica neue" w:cs="Georgia"/>
+          <w:i/>
+          <w:color w:val="000000"/>
+        </w:rPr>
+        <w:t>AutoWash</w:t>
+      </w:r>
+      <w:proofErr w:type="spellEnd"/>
+      <w:r>
+        <w:rPr>
+          <w:rFonts w:ascii="helvetica neue" w:eastAsia="Georgia" w:hAnsi="helvetica neue" w:cs="Georgia"/>
+          <w:i/>
+          <w:color w:val="000000"/>
+        </w:rPr>
+        <w:t xml:space="preserve"> Priority Booking Engine modules and their relationships.</w:t>
       </w:r>
     </w:p>
     <w:p>
@@ -2088,6 +2250,7 @@
         <w:rPr>
           <w:noProof/>
         </w:rPr>
+        <w:lastRenderedPageBreak/>
         <w:drawing>
           <wp:inline distT="0" distB="0" distL="0" distR="0" wp14:anchorId="23E51EC5" wp14:editId="27DA434F">
             <wp:extent cx="5760720" cy="4160520"/>
@@ -2135,7 +2298,25 @@
           <w:i/>
           <w:color w:val="000000"/>
         </w:rPr>
-        <w:t>Caption: Initial logic flow for creating and allocating a car-wash booking.</w:t>
+        <w:t xml:space="preserve">Caption: Initial logic flow for creating and allocating a </w:t>
+      </w:r>
+      <w:proofErr w:type="gramStart"/>
+      <w:r>
+        <w:rPr>
+          <w:rFonts w:ascii="helvetica neue" w:eastAsia="Georgia" w:hAnsi="helvetica neue" w:cs="Georgia"/>
+          <w:i/>
+          <w:color w:val="000000"/>
+        </w:rPr>
+        <w:t>car-wash</w:t>
+      </w:r>
+      <w:proofErr w:type="gramEnd"/>
+      <w:r>
+        <w:rPr>
+          <w:rFonts w:ascii="helvetica neue" w:eastAsia="Georgia" w:hAnsi="helvetica neue" w:cs="Georgia"/>
+          <w:i/>
+          <w:color w:val="000000"/>
+        </w:rPr>
+        <w:t xml:space="preserve"> booking.</w:t>
       </w:r>
     </w:p>
     <w:p>
@@ -2184,20 +2365,6 @@
           <w:rFonts w:ascii="helvetica neue" w:hAnsi="helvetica neue"/>
         </w:rPr>
         <w:t>Formulated Research Question: How does using a priority queue instead of a standard FIFO queue affect booking fairness and processing efficiency when a car-wash waitlist contains customers with different membership tiers?</w:t>
-      </w:r>
-    </w:p>
-    <w:p>
-      <w:pPr>
-        <w:spacing w:after="100" w:line="360" w:lineRule="auto"/>
-        <w:ind w:left="630"/>
-      </w:pPr>
-      <w:r>
-        <w:rPr>
-          <w:rFonts w:ascii="helvetica neue" w:eastAsia="Georgia" w:hAnsi="helvetica neue" w:cs="Georgia"/>
-          <w:i/>
-          <w:color w:val="000000"/>
-        </w:rPr>
-        <w:t>(Write your RQ here. Example: "How does the choice between ArrayList and LinkedList affect the time complexity of insertion and deletion operations in a library management system with n &gt; 10,000 records?")</w:t>
       </w:r>
     </w:p>
     <w:p>
@@ -3239,6 +3406,17 @@
       <w:contextualSpacing/>
     </w:pPr>
   </w:style>
+  <w:style w:type="paragraph" w:customStyle="1" w:styleId="Binhthng1">
+    <w:name w:val="Bình thường1"/>
+    <w:basedOn w:val="Binhthng"/>
+    <w:rPr>
+      <w:rFonts w:hAnsi="Georgia" w:cs="Times New Roman"/>
+      <w:kern w:val="2"/>
+      <w:szCs w:val="21"/>
+      <w:lang w:val="vi-VN" w:eastAsia="vi-VN"/>
+      <w14:ligatures w14:val="standardContextual"/>
+    </w:rPr>
+  </w:style>
 </w:styles>
 </file>
 

</xml_diff>